<commit_message>
Stage 4 push 23. Stage 4 doc update
</commit_message>
<xml_diff>
--- a/com3810/docs/Stage 4 - Implementation Changes from Stage 3.docx
+++ b/com3810/docs/Stage 4 - Implementation Changes from Stage 3.docx
@@ -639,7 +639,25 @@
           <w:color w:val="183B61"/>
           <w:sz w:val="36"/>
         </w:rPr>
-        <w:t>6. New Work Added in This Chat: Cluster Manager Cluster and Restartability</w:t>
+        <w:t>6. New Work Added</w:t>
+      </w:r>
+      <w:r>
+        <w:rPr>
+          <w:rFonts w:ascii="Aptos Display" w:hAnsi="Aptos Display"/>
+          <w:b/>
+          <w:color w:val="183B61"/>
+          <w:sz w:val="36"/>
+        </w:rPr>
+        <w:t xml:space="preserve">: </w:t>
+      </w:r>
+      <w:r>
+        <w:rPr>
+          <w:rFonts w:ascii="Aptos Display" w:hAnsi="Aptos Display"/>
+          <w:b/>
+          <w:color w:val="183B61"/>
+          <w:sz w:val="36"/>
+        </w:rPr>
+        <w:t>Cluster Manager Cluster</w:t>
       </w:r>
     </w:p>
     <w:p>
@@ -651,7 +669,14 @@
           <w:rFonts w:ascii="Aptos" w:hAnsi="Aptos"/>
           <w:sz w:val="21"/>
         </w:rPr>
-        <w:t>In this chat, the platform moved further beyond the original Stage 3 idea of “a Cluster Manager exists” and into a more resilient operational design. Instead of a single Cluster Manager instance on port 9090, the startup script now launches a 3-node Cluster Manager ensemble on ports 9090, 9091, and 9092. These nodes expose cluster state and leader information, coordinate roles, and provide a more durable source of runtime status for the rest of the platform.</w:t>
+        <w:t>T</w:t>
+      </w:r>
+      <w:r>
+        <w:rPr>
+          <w:rFonts w:ascii="Aptos" w:hAnsi="Aptos"/>
+          <w:sz w:val="21"/>
+        </w:rPr>
+        <w:t>he platform moved further beyond the original Stage 3 idea of “a Cluster Manager exists” and into a more resilient operational design. Instead of a single Cluster Manager instance on port 9090, the startup script now launches a 3-node Cluster Manager ensemble on ports 9090, 9091, and 9092. These nodes expose cluster state and leader information, coordinate roles, and provide a more durable source of runtime status for the rest of the platform.</w:t>
       </w:r>
     </w:p>
     <w:p>
@@ -715,7 +740,6 @@
           <w:color w:val="183B61"/>
           <w:sz w:val="36"/>
         </w:rPr>
-        <w:lastRenderedPageBreak/>
         <w:t>8. Conclusion</w:t>
       </w:r>
     </w:p>
@@ -728,6 +752,7 @@
           <w:rFonts w:ascii="Aptos" w:hAnsi="Aptos"/>
           <w:sz w:val="21"/>
         </w:rPr>
+        <w:lastRenderedPageBreak/>
         <w:t>The most accurate way to describe Stage 4 is not “a few final improvements after Stage 3.” Stage 4 is the stage in which SecureNet was truly implemented as a full distributed platform. It is where the service graph came together, where the client and device planes became operational, where EPS/Raft and VSS were stabilized, where notification retries and outbox behavior became verifiable, where launcher-owned cleanup was introduced, and where the platform’s control plane gained stronger restart and clustering support.</w:t>
       </w:r>
     </w:p>

</xml_diff>